<commit_message>
Add RICE prioritization (workbook sheet + app tab + docs)
- Планирование_спринта_PRO.xlsx: new «RICE» sheet — features scored by
  RICE = (Reach × Impact × Confidence) / Effort with formulas, dropdowns
  (Impact/Confidence), RAG priority, color-scale on score, ranking, and a
  bar chart. Now 29 sheets.
- index.html: «RICE» tab — editable inputs, auto RICE score / rank /
  priority (RAG), bar chart, and a methodology legend. Added to Excel
  export; Reset now runs migrate() so new collections survive a reset.
- data/seed.json: RICE dataset (10 features).
- Both description docs: RICE section (methodology + parameters table);
  illustrated doc also gets a RICE bar chart image.
- README: note the RICE feature.

Co-Authored-By: Claude Opus 4.8 <noreply@anthropic.com>
</commit_message>
<xml_diff>
--- a/Описание_Планирование_спринта_PRO.docx
+++ b/Описание_Планирование_спринта_PRO.docx
@@ -2309,6 +2309,194 @@
         </w:tc>
       </w:tr>
     </w:tbl>
+    <w:p>
+      <w:pPr>
+        <w:pStyle w:val="Heading1"/>
+      </w:pPr>
+      <w:r>
+        <w:t>RICE — оценка приоритетов фич (лист RICE)</w:t>
+      </w:r>
+    </w:p>
+    <w:p>
+      <w:r>
+        <w:t>Назначение: приоритизация фич и инициатив по методологии RICE.</w:t>
+      </w:r>
+    </w:p>
+    <w:p>
+      <w:r>
+        <w:t>Что на листе: таблица фич с полями Reach, Impact, Confidence, Effort; авто-расчёт RICE score, ранга и приоритета (RAG-подсветка); диаграмма RICE по фичам.</w:t>
+      </w:r>
+    </w:p>
+    <w:p>
+      <w:r>
+        <w:t>Формула: RICE = (Reach × Impact × Confidence) / Effort.</w:t>
+      </w:r>
+    </w:p>
+    <w:tbl>
+      <w:tblPr>
+        <w:tblStyle w:val="LightGrid-Accent1"/>
+        <w:tblW w:type="auto" w:w="0"/>
+        <w:tblLook w:firstColumn="1" w:firstRow="1" w:lastColumn="0" w:lastRow="0" w:noHBand="0" w:noVBand="1" w:val="04A0"/>
+      </w:tblPr>
+      <w:tblGrid>
+        <w:gridCol w:w="4320"/>
+        <w:gridCol w:w="4320"/>
+      </w:tblGrid>
+      <w:tr>
+        <w:tc>
+          <w:tcPr>
+            <w:tcW w:type="dxa" w:w="4320"/>
+          </w:tcPr>
+          <w:p>
+            <w:r>
+              <w:t>Параметр</w:t>
+            </w:r>
+          </w:p>
+        </w:tc>
+        <w:tc>
+          <w:tcPr>
+            <w:tcW w:type="dxa" w:w="4320"/>
+          </w:tcPr>
+          <w:p>
+            <w:r>
+              <w:t>Описание</w:t>
+            </w:r>
+          </w:p>
+        </w:tc>
+      </w:tr>
+      <w:tr>
+        <w:tc>
+          <w:tcPr>
+            <w:tcW w:type="dxa" w:w="4320"/>
+          </w:tcPr>
+          <w:p>
+            <w:r>
+              <w:t>Reach</w:t>
+            </w:r>
+          </w:p>
+        </w:tc>
+        <w:tc>
+          <w:tcPr>
+            <w:tcW w:type="dxa" w:w="4320"/>
+          </w:tcPr>
+          <w:p>
+            <w:r>
+              <w:t>Охват — сколько пользователей затронет фича за квартал.</w:t>
+            </w:r>
+          </w:p>
+        </w:tc>
+      </w:tr>
+      <w:tr>
+        <w:tc>
+          <w:tcPr>
+            <w:tcW w:type="dxa" w:w="4320"/>
+          </w:tcPr>
+          <w:p>
+            <w:r>
+              <w:t>Impact</w:t>
+            </w:r>
+          </w:p>
+        </w:tc>
+        <w:tc>
+          <w:tcPr>
+            <w:tcW w:type="dxa" w:w="4320"/>
+          </w:tcPr>
+          <w:p>
+            <w:r>
+              <w:t>Влияние на пользователя: 3 — массивное, 2 — высокое, 1 — среднее, 0.5 — низкое, 0.25 — минимальное.</w:t>
+            </w:r>
+          </w:p>
+        </w:tc>
+      </w:tr>
+      <w:tr>
+        <w:tc>
+          <w:tcPr>
+            <w:tcW w:type="dxa" w:w="4320"/>
+          </w:tcPr>
+          <w:p>
+            <w:r>
+              <w:t>Confidence</w:t>
+            </w:r>
+          </w:p>
+        </w:tc>
+        <w:tc>
+          <w:tcPr>
+            <w:tcW w:type="dxa" w:w="4320"/>
+          </w:tcPr>
+          <w:p>
+            <w:r>
+              <w:t>Уверенность в оценке: 100% — высокая, 80% — средняя, 50% — низкая.</w:t>
+            </w:r>
+          </w:p>
+        </w:tc>
+      </w:tr>
+      <w:tr>
+        <w:tc>
+          <w:tcPr>
+            <w:tcW w:type="dxa" w:w="4320"/>
+          </w:tcPr>
+          <w:p>
+            <w:r>
+              <w:t>Effort</w:t>
+            </w:r>
+          </w:p>
+        </w:tc>
+        <w:tc>
+          <w:tcPr>
+            <w:tcW w:type="dxa" w:w="4320"/>
+          </w:tcPr>
+          <w:p>
+            <w:r>
+              <w:t>Трудозатраты команды на фичу, человеко-дни.</w:t>
+            </w:r>
+          </w:p>
+        </w:tc>
+      </w:tr>
+      <w:tr>
+        <w:tc>
+          <w:tcPr>
+            <w:tcW w:type="dxa" w:w="4320"/>
+          </w:tcPr>
+          <w:p>
+            <w:r>
+              <w:t>RICE score</w:t>
+            </w:r>
+          </w:p>
+        </w:tc>
+        <w:tc>
+          <w:tcPr>
+            <w:tcW w:type="dxa" w:w="4320"/>
+          </w:tcPr>
+          <w:p>
+            <w:r>
+              <w:t>(Reach × Impact × Confidence) / Effort — итоговый балл; чем выше, тем приоритетнее.</w:t>
+            </w:r>
+          </w:p>
+        </w:tc>
+      </w:tr>
+      <w:tr>
+        <w:tc>
+          <w:tcPr>
+            <w:tcW w:type="dxa" w:w="4320"/>
+          </w:tcPr>
+          <w:p>
+            <w:r>
+              <w:t>Приоритет</w:t>
+            </w:r>
+          </w:p>
+        </w:tc>
+        <w:tc>
+          <w:tcPr>
+            <w:tcW w:type="dxa" w:w="4320"/>
+          </w:tcPr>
+          <w:p>
+            <w:r>
+              <w:t>Высокий ≥ 60% максимального балла, Средний ≥ 30%, иначе Низкий.</w:t>
+            </w:r>
+          </w:p>
+        </w:tc>
+      </w:tr>
+    </w:tbl>
     <w:sectPr>
       <w:pgSz w:w="12240" w:h="15840"/>
       <w:pgMar w:top="1440" w:right="1800" w:bottom="1440" w:left="1800" w:header="720" w:footer="720" w:gutter="0"/>

</xml_diff>

<commit_message>
Add cross-stream dependencies (page + Gantt markers + workbook + docs)
- index.html: new «Зависимости» tab — editable cross-stream dependencies
  (element, type, external stream, direction, description, sprint, status
  with RAG, owner, risk), KPIs (total / blocked / inbound / outbound),
  charts by status and by stream, and an escalation list of blocked items.
  The Gantt now draws a ◆ marker (colored by status) on tasks that have an
  external dependency, with a tooltip; added to Excel export and legend.
- Планирование_спринта_PRO.xlsx: new «Зависимости» sheet (dropdowns, RAG,
  status chart) and a ◆ flag column on the «Гант» sheet via VLOOKUP. 30 sheets.
- data/seed.json: 8 cross-stream dependencies.
- Both description docs: «Зависимости» section (fields table); illustrated
  doc also gets a stream→item dependency map image.
- README: note the dependencies feature.

Co-Authored-By: Claude Opus 4.8 <noreply@anthropic.com>
</commit_message>
<xml_diff>
--- a/Описание_Планирование_спринта_PRO.docx
+++ b/Описание_Планирование_спринта_PRO.docx
@@ -2497,6 +2497,211 @@
         </w:tc>
       </w:tr>
     </w:tbl>
+    <w:p>
+      <w:pPr>
+        <w:pStyle w:val="Heading1"/>
+      </w:pPr>
+      <w:r>
+        <w:t>Зависимости от других стримов (лист Зависимости)</w:t>
+      </w:r>
+    </w:p>
+    <w:p>
+      <w:r>
+        <w:t>Назначение: учёт межстримовых зависимостей задач, историй и фич — от чего мы зависим у смежных команд и что зависит от нас.</w:t>
+      </w:r>
+    </w:p>
+    <w:p>
+      <w:r>
+        <w:t>Что на листе: таблица зависимостей (элемент, тип, внешний стрим, направление, описание, спринт, статус с RAG-подсветкой, владелец, риск); сводка и диаграмма по статусам. На листе «Гант» добавлена колонка-флаг ◆ для задач с внешней зависимостью; в приложении зависимости отображаются маркерами ◆ прямо на диаграмме Ганта (цвет — статус).</w:t>
+      </w:r>
+    </w:p>
+    <w:tbl>
+      <w:tblPr>
+        <w:tblStyle w:val="LightGrid-Accent1"/>
+        <w:tblW w:type="auto" w:w="0"/>
+        <w:tblLook w:firstColumn="1" w:firstRow="1" w:lastColumn="0" w:lastRow="0" w:noHBand="0" w:noVBand="1" w:val="04A0"/>
+      </w:tblPr>
+      <w:tblGrid>
+        <w:gridCol w:w="4320"/>
+        <w:gridCol w:w="4320"/>
+      </w:tblGrid>
+      <w:tr>
+        <w:tc>
+          <w:tcPr>
+            <w:tcW w:type="dxa" w:w="4320"/>
+          </w:tcPr>
+          <w:p>
+            <w:r>
+              <w:t>Поле</w:t>
+            </w:r>
+          </w:p>
+        </w:tc>
+        <w:tc>
+          <w:tcPr>
+            <w:tcW w:type="dxa" w:w="4320"/>
+          </w:tcPr>
+          <w:p>
+            <w:r>
+              <w:t>Описание</w:t>
+            </w:r>
+          </w:p>
+        </w:tc>
+      </w:tr>
+      <w:tr>
+        <w:tc>
+          <w:tcPr>
+            <w:tcW w:type="dxa" w:w="4320"/>
+          </w:tcPr>
+          <w:p>
+            <w:r>
+              <w:t>Элемент</w:t>
+            </w:r>
+          </w:p>
+        </w:tc>
+        <w:tc>
+          <w:tcPr>
+            <w:tcW w:type="dxa" w:w="4320"/>
+          </w:tcPr>
+          <w:p>
+            <w:r>
+              <w:t>Наша задача, история или фича, у которой есть внешняя зависимость.</w:t>
+            </w:r>
+          </w:p>
+        </w:tc>
+      </w:tr>
+      <w:tr>
+        <w:tc>
+          <w:tcPr>
+            <w:tcW w:type="dxa" w:w="4320"/>
+          </w:tcPr>
+          <w:p>
+            <w:r>
+              <w:t>Тип</w:t>
+            </w:r>
+          </w:p>
+        </w:tc>
+        <w:tc>
+          <w:tcPr>
+            <w:tcW w:type="dxa" w:w="4320"/>
+          </w:tcPr>
+          <w:p>
+            <w:r>
+              <w:t>История · Задача · Фича · Эпик.</w:t>
+            </w:r>
+          </w:p>
+        </w:tc>
+      </w:tr>
+      <w:tr>
+        <w:tc>
+          <w:tcPr>
+            <w:tcW w:type="dxa" w:w="4320"/>
+          </w:tcPr>
+          <w:p>
+            <w:r>
+              <w:t>Задача (Гант)</w:t>
+            </w:r>
+          </w:p>
+        </w:tc>
+        <w:tc>
+          <w:tcPr>
+            <w:tcW w:type="dxa" w:w="4320"/>
+          </w:tcPr>
+          <w:p>
+            <w:r>
+              <w:t>Ссылка на задачу бэклога — по ней ставится маркер ◆ на диаграмме Ганта.</w:t>
+            </w:r>
+          </w:p>
+        </w:tc>
+      </w:tr>
+      <w:tr>
+        <w:tc>
+          <w:tcPr>
+            <w:tcW w:type="dxa" w:w="4320"/>
+          </w:tcPr>
+          <w:p>
+            <w:r>
+              <w:t>Внешний стрим</w:t>
+            </w:r>
+          </w:p>
+        </w:tc>
+        <w:tc>
+          <w:tcPr>
+            <w:tcW w:type="dxa" w:w="4320"/>
+          </w:tcPr>
+          <w:p>
+            <w:r>
+              <w:t>Смежная команда/стрим, с которым связана зависимость.</w:t>
+            </w:r>
+          </w:p>
+        </w:tc>
+      </w:tr>
+      <w:tr>
+        <w:tc>
+          <w:tcPr>
+            <w:tcW w:type="dxa" w:w="4320"/>
+          </w:tcPr>
+          <w:p>
+            <w:r>
+              <w:t>Направление</w:t>
+            </w:r>
+          </w:p>
+        </w:tc>
+        <w:tc>
+          <w:tcPr>
+            <w:tcW w:type="dxa" w:w="4320"/>
+          </w:tcPr>
+          <w:p>
+            <w:r>
+              <w:t>«Мы зависим» (входящая) или «Зависят от нас» (исходящая).</w:t>
+            </w:r>
+          </w:p>
+        </w:tc>
+      </w:tr>
+      <w:tr>
+        <w:tc>
+          <w:tcPr>
+            <w:tcW w:type="dxa" w:w="4320"/>
+          </w:tcPr>
+          <w:p>
+            <w:r>
+              <w:t>Статус</w:t>
+            </w:r>
+          </w:p>
+        </w:tc>
+        <w:tc>
+          <w:tcPr>
+            <w:tcW w:type="dxa" w:w="4320"/>
+          </w:tcPr>
+          <w:p>
+            <w:r>
+              <w:t>Ожидается · Подтверждено · Получено · Заблокировано · Просрочено (RAG-подсветка).</w:t>
+            </w:r>
+          </w:p>
+        </w:tc>
+      </w:tr>
+      <w:tr>
+        <w:tc>
+          <w:tcPr>
+            <w:tcW w:type="dxa" w:w="4320"/>
+          </w:tcPr>
+          <w:p>
+            <w:r>
+              <w:t>Риск</w:t>
+            </w:r>
+          </w:p>
+        </w:tc>
+        <w:tc>
+          <w:tcPr>
+            <w:tcW w:type="dxa" w:w="4320"/>
+          </w:tcPr>
+          <w:p>
+            <w:r>
+              <w:t>High · Medium · Low.</w:t>
+            </w:r>
+          </w:p>
+        </w:tc>
+      </w:tr>
+    </w:tbl>
     <w:sectPr>
       <w:pgSz w:w="12240" w:h="15840"/>
       <w:pgMar w:top="1440" w:right="1800" w:bottom="1440" w:left="1800" w:header="720" w:footer="720" w:gutter="0"/>

</xml_diff>